<commit_message>
Update portfolio projects and CV
</commit_message>
<xml_diff>
--- a/public/Abdellatif_El_Fagrouch_CV.docx
+++ b/public/Abdellatif_El_Fagrouch_CV.docx
@@ -112,12 +112,7 @@
         <w:spacing w:after="45"/>
       </w:pPr>
       <w:r>
-        <w:rPr>
-          <w:color w:val="1A1A1A"/>
-          <w:sz w:val="20"/>
-          <w:szCs w:val="20"/>
-        </w:rPr>
-        <w:t xml:space="preserve">Full-stack developer and final-year Software Engineering student at 1337 (42 Network), currently completing a graduation internship at Somayar building a production e-ticketing platform for transit networks. Comfortable across the stack — React/Next.js on the front end, NestJS/Node.js on the back end, PostgreSQL/Prisma for data, Docker and Socket.IO for infrastructure and real-time systems — with a strong systems-programming foundation in C/C++ and Unix internals. Builds and ships independent full-stack products end-to-end, from architecture and security hardening to deployment and CI/CD.</w:t>
+        <w:t>Full-stack developer with advanced Software Engineering training at 1337 (42 Network), currently completing a graduation internship at Somayar on a production e-ticketing platform for transit networks. Comfortable across React/Next.js, NestJS/Node.js, PostgreSQL/Prisma, Docker, and Socket.IO, with a strong systems-programming foundation in C/C++ and Unix internals. Builds and ships full-stack products from architecture and security hardening through deployment and CI/CD.</w:t>
       </w:r>
     </w:p>
     <w:p>
@@ -388,87 +383,90 @@
           <w:sz w:val="22"/>
           <w:szCs w:val="22"/>
         </w:rPr>
-        <w:t xml:space="preserve">AnimeHub.studio</w:t>
-      </w:r>
-      <w:r>
-        <w:rPr>
-          <w:color w:val="1A1A1A"/>
-          <w:sz w:val="22"/>
-          <w:szCs w:val="22"/>
-        </w:rPr>
-        <w:t xml:space="preserve">  —  Full-Stack Anime Community Platform</w:t>
-      </w:r>
-    </w:p>
-    <w:p>
-      <w:pPr>
-        <w:pStyle w:val="ListParagraph"/>
-        <w:numPr>
-          <w:ilvl w:val="0"/>
-          <w:numId w:val="2"/>
-        </w:numPr>
-        <w:spacing w:after="45"/>
-      </w:pPr>
-      <w:r>
-        <w:rPr>
-          <w:color w:val="1A1A1A"/>
-          <w:sz w:val="20"/>
-          <w:szCs w:val="20"/>
-        </w:rPr>
-        <w:t xml:space="preserve">Engineered a containerized platform (Next.js, Node.js/Express, Socket.IO, Prisma/MariaDB, Docker Compose, Nginx, GitHub Actions → EC2) with synchronized watch rooms and live metadata sync via the Jikan API.</w:t>
-      </w:r>
-    </w:p>
-    <w:p>
-      <w:pPr>
-        <w:pStyle w:val="ListParagraph"/>
-        <w:numPr>
-          <w:ilvl w:val="0"/>
-          <w:numId w:val="2"/>
-        </w:numPr>
-        <w:spacing w:after="45"/>
-      </w:pPr>
-      <w:r>
-        <w:rPr>
-          <w:color w:val="1A1A1A"/>
-          <w:sz w:val="20"/>
-          <w:szCs w:val="20"/>
-        </w:rPr>
-        <w:t xml:space="preserve">Increased user engagement by 30% by shipping real-time synchronized video playback and resolving stale-closure and reconnection bugs.</w:t>
-      </w:r>
-    </w:p>
-    <w:p>
-      <w:pPr>
-        <w:pStyle w:val="ListParagraph"/>
-        <w:numPr>
-          <w:ilvl w:val="0"/>
-          <w:numId w:val="2"/>
-        </w:numPr>
-        <w:spacing w:after="45"/>
-      </w:pPr>
-      <w:r>
-        <w:rPr>
-          <w:color w:val="1A1A1A"/>
-          <w:sz w:val="20"/>
-          <w:szCs w:val="20"/>
-        </w:rPr>
-        <w:t xml:space="preserve">Integrated an LLM assistant (Groq Llama 3.3 70B) for personalized, Arabic-aware content recommendations.</w:t>
-      </w:r>
-    </w:p>
-    <w:p>
-      <w:pPr>
-        <w:pStyle w:val="ListParagraph"/>
-        <w:numPr>
-          <w:ilvl w:val="0"/>
-          <w:numId w:val="2"/>
-        </w:numPr>
-        <w:spacing w:after="45"/>
-      </w:pPr>
-      <w:r>
-        <w:rPr>
-          <w:color w:val="1A1A1A"/>
-          <w:sz w:val="20"/>
-          <w:szCs w:val="20"/>
-        </w:rPr>
-        <w:t xml:space="preserve">Led several security hardening passes: removed committed secrets, fixed JWT-in-URL exposure, and tightened CSP policy.</w:t>
+        <w:t>DakkanPro</w:t>
+      </w:r>
+      <w:r>
+        <w:rPr>
+          <w:color w:val="1A1A1A"/>
+          <w:sz w:val="22"/>
+          <w:szCs w:val="22"/>
+        </w:rPr>
+        <w:t xml:space="preserve">  —  Mobile POS &amp; Retail Management</w:t>
+      </w:r>
+    </w:p>
+    <w:p>
+      <w:pPr>
+        <w:pStyle w:val="ListParagraph"/>
+        <w:numPr>
+          <w:ilvl w:val="0"/>
+          <w:numId w:val="2"/>
+        </w:numPr>
+        <w:spacing w:after="45"/>
+      </w:pPr>
+      <w:r>
+        <w:t>Built an offline-first mobile POS and shop-management app for small retailers using React Native, Expo, TypeScript, and SQLite.</w:t>
+      </w:r>
+    </w:p>
+    <w:p>
+      <w:pPr>
+        <w:pStyle w:val="ListParagraph"/>
+        <w:numPr>
+          <w:ilvl w:val="0"/>
+          <w:numId w:val="2"/>
+        </w:numPr>
+        <w:spacing w:after="45"/>
+      </w:pPr>
+      <w:r>
+        <w:t>Implemented sales, inventory, customer credit, cash sessions, reports, and local backup/restore through feature-based services.</w:t>
+      </w:r>
+    </w:p>
+    <w:p>
+      <w:pPr>
+        <w:spacing w:after="15" w:before="90"/>
+      </w:pPr>
+      <w:r>
+        <w:rPr>
+          <w:b/>
+          <w:bCs/>
+          <w:color w:val="1A1A1A"/>
+          <w:sz w:val="22"/>
+          <w:szCs w:val="22"/>
+        </w:rPr>
+        <w:t>ApplyPilot</w:t>
+      </w:r>
+      <w:r>
+        <w:rPr>
+          <w:color w:val="1A1A1A"/>
+          <w:sz w:val="22"/>
+          <w:szCs w:val="22"/>
+        </w:rPr>
+        <w:t xml:space="preserve">  —  Job Search &amp; Application Platform</w:t>
+      </w:r>
+    </w:p>
+    <w:p>
+      <w:pPr>
+        <w:pStyle w:val="ListParagraph"/>
+        <w:numPr>
+          <w:ilvl w:val="0"/>
+          <w:numId w:val="2"/>
+        </w:numPr>
+        <w:spacing w:after="45"/>
+      </w:pPr>
+      <w:r>
+        <w:t>Created a local-first job-search platform with a seven-stage application pipeline, CV library, and cover-letter studio.</w:t>
+      </w:r>
+    </w:p>
+    <w:p>
+      <w:pPr>
+        <w:pStyle w:val="ListParagraph"/>
+        <w:numPr>
+          <w:ilvl w:val="0"/>
+          <w:numId w:val="2"/>
+        </w:numPr>
+        <w:spacing w:after="45"/>
+      </w:pPr>
+      <w:r>
+        <w:t>Added recruiter email discovery, scheduled outreach, and inbox reply tracking with Next.js, TypeScript, Tailwind CSS, Nodemailer, and IMAP.</w:t>
       </w:r>
     </w:p>
     <w:p>

</xml_diff>